<commit_message>
Rd file for proyect
</commit_message>
<xml_diff>
--- a/documents/RD_Chupi.docx
+++ b/documents/RD_Chupi.docx
@@ -2881,24 +2881,66 @@
     </w:p>
     <w:p>
       <w:pPr>
-        <w:spacing w:after="120"/>
+        <w:spacing w:before="120" w:after="120"/>
+        <w:jc w:val="center"/>
+      </w:pPr>
+      <w:r>
+        <w:drawing>
+          <wp:inline distT="0" distB="0" distL="0" distR="0">
+            <wp:extent cx="5334000" cy="4095750"/>
+            <wp:effectExtent t="0" r="0" b="0" l="0"/>
+            <wp:docPr id="1" name="" descr="" title=""/>
+            <wp:cNvGraphicFramePr>
+              <a:graphicFrameLocks xmlns:a="http://schemas.openxmlformats.org/drawingml/2006/main" noChangeAspect="1"/>
+            </wp:cNvGraphicFramePr>
+            <a:graphic xmlns:a="http://schemas.openxmlformats.org/drawingml/2006/main">
+              <a:graphicData uri="http://schemas.openxmlformats.org/drawingml/2006/picture">
+                <pic:pic xmlns:pic="http://schemas.openxmlformats.org/drawingml/2006/picture">
+                  <pic:nvPicPr>
+                    <pic:cNvPr id="0" name="" descr=""/>
+                    <pic:cNvPicPr>
+                      <a:picLocks noChangeAspect="1" noChangeArrowheads="1"/>
+                    </pic:cNvPicPr>
+                  </pic:nvPicPr>
+                  <pic:blipFill>
+                    <a:blip r:embed="rId6" cstate="none"/>
+                    <a:srcRect/>
+                    <a:stretch>
+                      <a:fillRect/>
+                    </a:stretch>
+                  </pic:blipFill>
+                  <pic:spPr bwMode="auto">
+                    <a:xfrm>
+                      <a:off x="0" y="0"/>
+                      <a:ext cx="5334000" cy="4095750"/>
+                    </a:xfrm>
+                    <a:prstGeom prst="rect">
+                      <a:avLst/>
+                    </a:prstGeom>
+                  </pic:spPr>
+                </pic:pic>
+              </a:graphicData>
+            </a:graphic>
+          </wp:inline>
+        </w:drawing>
+      </w:r>
+    </w:p>
+    <w:p>
+      <w:pPr>
+        <w:spacing w:after="200"/>
+        <w:jc w:val="center"/>
       </w:pPr>
       <w:r>
         <w:rPr>
           <w:rFonts w:ascii="Arial" w:cs="Arial" w:eastAsia="Arial" w:hAnsi="Arial"/>
           <w:i/>
           <w:iCs/>
-          <w:color w:val="666666"/>
-          <w:sz w:val="20"/>
-          <w:szCs w:val="20"/>
+          <w:color w:val="555555"/>
+          <w:sz w:val="18"/>
+          <w:szCs w:val="18"/>
         </w:rPr>
-        <w:t xml:space="preserve">[Use case diagram to be inserted here – create using a UML tool such as draw.io, Lucidchart, or StarUML showing the Player actor connected to: Register Players, Select Game, Play Truth or Drink, Play Most Likely, Play Dare Roulette, Play Imposter, Play Waterfall, Play Party Mode, and Quit Application. Party Mode should show «include» relationships to the other five game use cases.]</w:t>
+        <w:t xml:space="preserve">Figure 1: Use Case Diagram for Chupi</w:t>
       </w:r>
-    </w:p>
-    <w:p>
-      <w:pPr>
-        <w:spacing w:after="0"/>
-      </w:pPr>
     </w:p>
     <w:p>
       <w:pPr>
@@ -5195,7 +5237,7 @@
           <w:sz w:val="20"/>
           <w:szCs w:val="20"/>
         </w:rPr>
-        <w:t xml:space="preserve">The system follows an object-oriented design built around two core classes and six game subclasses. The Player class encapsulates player identity (name attribute) and string representation methods. The GameBase abstract class provides shared functionality including a list of Player objects, the game name, a turn counter, and methods for getting the current player (get_current_player), advancing turns (next_turn), and an abstract play method that all subclasses must implement.</w:t>
+        <w:t xml:space="preserve">The system follows an object-oriented design built around two core classes and six game subclasses. The Player class encapsulates player identity (name attribute) and string representation methods. The GameBase abstract class provides shared functionality including a list of Player objects, the game name, a turn counter, and methods for getting the current player, advancing turns, and an abstract play method that all subclasses must implement.</w:t>
       </w:r>
     </w:p>
     <w:p>
@@ -5208,29 +5250,71 @@
           <w:sz w:val="20"/>
           <w:szCs w:val="20"/>
         </w:rPr>
-        <w:t xml:space="preserve">Six concrete game classes inherit from GameBase: TruthOrDrink, MostLikely, DareRoulette, Imposter, Waterfall, and PartyMode. Each overrides the play() method with its own game logic. The main module (src.main) orchestrates the application by creating Player objects via get_players(), displaying the menu via show_game_menu(), and mapping user choices to the corresponding game class, which it instantiates and invokes.</w:t>
+        <w:t xml:space="preserve">Six concrete game classes inherit from GameBase: TruthOrDrink, MostLikely, DareRoulette, Imposter, Waterfall, and PartyMode. Each overrides the play() method with its own game logic. The main module (src.main) orchestrates the application by creating Player objects via get_players(), displaying the menu via show_game_menu(), and mapping user choices to the corresponding game class.</w:t>
       </w:r>
     </w:p>
     <w:p>
       <w:pPr>
-        <w:spacing w:after="120"/>
+        <w:spacing w:before="120" w:after="120"/>
+        <w:jc w:val="center"/>
+      </w:pPr>
+      <w:r>
+        <w:drawing>
+          <wp:inline distT="0" distB="0" distL="0" distR="0">
+            <wp:extent cx="5715000" cy="4095750"/>
+            <wp:effectExtent t="0" r="0" b="0" l="0"/>
+            <wp:docPr id="1" name="" descr="" title=""/>
+            <wp:cNvGraphicFramePr>
+              <a:graphicFrameLocks xmlns:a="http://schemas.openxmlformats.org/drawingml/2006/main" noChangeAspect="1"/>
+            </wp:cNvGraphicFramePr>
+            <a:graphic xmlns:a="http://schemas.openxmlformats.org/drawingml/2006/main">
+              <a:graphicData uri="http://schemas.openxmlformats.org/drawingml/2006/picture">
+                <pic:pic xmlns:pic="http://schemas.openxmlformats.org/drawingml/2006/picture">
+                  <pic:nvPicPr>
+                    <pic:cNvPr id="0" name="" descr=""/>
+                    <pic:cNvPicPr>
+                      <a:picLocks noChangeAspect="1" noChangeArrowheads="1"/>
+                    </pic:cNvPicPr>
+                  </pic:nvPicPr>
+                  <pic:blipFill>
+                    <a:blip r:embed="rId7" cstate="none"/>
+                    <a:srcRect/>
+                    <a:stretch>
+                      <a:fillRect/>
+                    </a:stretch>
+                  </pic:blipFill>
+                  <pic:spPr bwMode="auto">
+                    <a:xfrm>
+                      <a:off x="0" y="0"/>
+                      <a:ext cx="5715000" cy="4095750"/>
+                    </a:xfrm>
+                    <a:prstGeom prst="rect">
+                      <a:avLst/>
+                    </a:prstGeom>
+                  </pic:spPr>
+                </pic:pic>
+              </a:graphicData>
+            </a:graphic>
+          </wp:inline>
+        </w:drawing>
+      </w:r>
+    </w:p>
+    <w:p>
+      <w:pPr>
+        <w:spacing w:after="200"/>
+        <w:jc w:val="center"/>
       </w:pPr>
       <w:r>
         <w:rPr>
           <w:rFonts w:ascii="Arial" w:cs="Arial" w:eastAsia="Arial" w:hAnsi="Arial"/>
           <w:i/>
           <w:iCs/>
-          <w:color w:val="666666"/>
-          <w:sz w:val="20"/>
-          <w:szCs w:val="20"/>
+          <w:color w:val="555555"/>
+          <w:sz w:val="18"/>
+          <w:szCs w:val="18"/>
         </w:rPr>
-        <w:t xml:space="preserve">[Class diagram to be inserted here – create using a UML tool showing: Player class with attributes (name: str) and methods (__str__, __repr__); GameBase abstract class with attributes (players: List[Player], name: str, current_turn: int) and methods (get_current_player, next_turn, play); six subclasses (TruthOrDrink, MostLikely, DareRoulette, Imposter, Waterfall, PartyMode) each inheriting from GameBase and overriding play(). Show composition relationship from GameBase to Player (1 to many).]</w:t>
+        <w:t xml:space="preserve">Figure 2: Class Diagram for Chupi</w:t>
       </w:r>
-    </w:p>
-    <w:p>
-      <w:pPr>
-        <w:spacing w:after="0"/>
-      </w:pPr>
     </w:p>
     <w:p>
       <w:pPr>
@@ -5270,29 +5354,71 @@
           <w:sz w:val="20"/>
           <w:szCs w:val="20"/>
         </w:rPr>
-        <w:t xml:space="preserve">The main module prompts for the number of players, validates it is between 2 and 10, then iterates through each slot prompting for a name, validating it is non-empty, and creating a Player object. The completed list of Player objects is returned to the main loop.</w:t>
+        <w:t xml:space="preserve">The main module prompts the user for the number of players, validates that it is between 2 and 10, then iterates through each slot prompting for a name, validating it is non-empty, and creating a Player object. The completed list of Player objects is returned to the main loop.</w:t>
       </w:r>
     </w:p>
     <w:p>
       <w:pPr>
-        <w:spacing w:after="120"/>
+        <w:spacing w:before="120" w:after="120"/>
+        <w:jc w:val="center"/>
+      </w:pPr>
+      <w:r>
+        <w:drawing>
+          <wp:inline distT="0" distB="0" distL="0" distR="0">
+            <wp:extent cx="4762500" cy="3714750"/>
+            <wp:effectExtent t="0" r="0" b="0" l="0"/>
+            <wp:docPr id="1" name="" descr="" title=""/>
+            <wp:cNvGraphicFramePr>
+              <a:graphicFrameLocks xmlns:a="http://schemas.openxmlformats.org/drawingml/2006/main" noChangeAspect="1"/>
+            </wp:cNvGraphicFramePr>
+            <a:graphic xmlns:a="http://schemas.openxmlformats.org/drawingml/2006/main">
+              <a:graphicData uri="http://schemas.openxmlformats.org/drawingml/2006/picture">
+                <pic:pic xmlns:pic="http://schemas.openxmlformats.org/drawingml/2006/picture">
+                  <pic:nvPicPr>
+                    <pic:cNvPr id="0" name="" descr=""/>
+                    <pic:cNvPicPr>
+                      <a:picLocks noChangeAspect="1" noChangeArrowheads="1"/>
+                    </pic:cNvPicPr>
+                  </pic:nvPicPr>
+                  <pic:blipFill>
+                    <a:blip r:embed="rId8" cstate="none"/>
+                    <a:srcRect/>
+                    <a:stretch>
+                      <a:fillRect/>
+                    </a:stretch>
+                  </pic:blipFill>
+                  <pic:spPr bwMode="auto">
+                    <a:xfrm>
+                      <a:off x="0" y="0"/>
+                      <a:ext cx="4762500" cy="3714750"/>
+                    </a:xfrm>
+                    <a:prstGeom prst="rect">
+                      <a:avLst/>
+                    </a:prstGeom>
+                  </pic:spPr>
+                </pic:pic>
+              </a:graphicData>
+            </a:graphic>
+          </wp:inline>
+        </w:drawing>
+      </w:r>
+    </w:p>
+    <w:p>
+      <w:pPr>
+        <w:spacing w:after="200"/>
+        <w:jc w:val="center"/>
       </w:pPr>
       <w:r>
         <w:rPr>
           <w:rFonts w:ascii="Arial" w:cs="Arial" w:eastAsia="Arial" w:hAnsi="Arial"/>
           <w:i/>
           <w:iCs/>
-          <w:color w:val="666666"/>
-          <w:sz w:val="20"/>
-          <w:szCs w:val="20"/>
+          <w:color w:val="555555"/>
+          <w:sz w:val="18"/>
+          <w:szCs w:val="18"/>
         </w:rPr>
-        <w:t xml:space="preserve">[Sequence diagram to be inserted here – Actors/objects: User, main, Player. Show loop for input validation and player creation.]</w:t>
+        <w:t xml:space="preserve">Figure 3: Sequence Diagram – Player Registration</w:t>
       </w:r>
-    </w:p>
-    <w:p>
-      <w:pPr>
-        <w:spacing w:after="0"/>
-      </w:pPr>
     </w:p>
     <w:p>
       <w:pPr>
@@ -5324,24 +5450,66 @@
     </w:p>
     <w:p>
       <w:pPr>
-        <w:spacing w:after="120"/>
+        <w:spacing w:before="120" w:after="120"/>
+        <w:jc w:val="center"/>
+      </w:pPr>
+      <w:r>
+        <w:drawing>
+          <wp:inline distT="0" distB="0" distL="0" distR="0">
+            <wp:extent cx="4953000" cy="3524250"/>
+            <wp:effectExtent t="0" r="0" b="0" l="0"/>
+            <wp:docPr id="1" name="" descr="" title=""/>
+            <wp:cNvGraphicFramePr>
+              <a:graphicFrameLocks xmlns:a="http://schemas.openxmlformats.org/drawingml/2006/main" noChangeAspect="1"/>
+            </wp:cNvGraphicFramePr>
+            <a:graphic xmlns:a="http://schemas.openxmlformats.org/drawingml/2006/main">
+              <a:graphicData uri="http://schemas.openxmlformats.org/drawingml/2006/picture">
+                <pic:pic xmlns:pic="http://schemas.openxmlformats.org/drawingml/2006/picture">
+                  <pic:nvPicPr>
+                    <pic:cNvPr id="0" name="" descr=""/>
+                    <pic:cNvPicPr>
+                      <a:picLocks noChangeAspect="1" noChangeArrowheads="1"/>
+                    </pic:cNvPicPr>
+                  </pic:nvPicPr>
+                  <pic:blipFill>
+                    <a:blip r:embed="rId9" cstate="none"/>
+                    <a:srcRect/>
+                    <a:stretch>
+                      <a:fillRect/>
+                    </a:stretch>
+                  </pic:blipFill>
+                  <pic:spPr bwMode="auto">
+                    <a:xfrm>
+                      <a:off x="0" y="0"/>
+                      <a:ext cx="4953000" cy="3524250"/>
+                    </a:xfrm>
+                    <a:prstGeom prst="rect">
+                      <a:avLst/>
+                    </a:prstGeom>
+                  </pic:spPr>
+                </pic:pic>
+              </a:graphicData>
+            </a:graphic>
+          </wp:inline>
+        </w:drawing>
+      </w:r>
+    </w:p>
+    <w:p>
+      <w:pPr>
+        <w:spacing w:after="200"/>
+        <w:jc w:val="center"/>
       </w:pPr>
       <w:r>
         <w:rPr>
           <w:rFonts w:ascii="Arial" w:cs="Arial" w:eastAsia="Arial" w:hAnsi="Arial"/>
           <w:i/>
           <w:iCs/>
-          <w:color w:val="666666"/>
-          <w:sz w:val="20"/>
-          <w:szCs w:val="20"/>
+          <w:color w:val="555555"/>
+          <w:sz w:val="18"/>
+          <w:szCs w:val="18"/>
         </w:rPr>
-        <w:t xml:space="preserve">[Sequence diagram to be inserted here – Actors/objects: User, main, show_game_menu, GameClass (e.g., TruthOrDrink). Show the mapping lookup, instantiation, and play() call.]</w:t>
+        <w:t xml:space="preserve">Figure 4: Sequence Diagram – Game Selection and Launch</w:t>
       </w:r>
-    </w:p>
-    <w:p>
-      <w:pPr>
-        <w:spacing w:after="0"/>
-      </w:pPr>
     </w:p>
     <w:p>
       <w:pPr>
@@ -5368,23 +5536,70 @@
           <w:sz w:val="20"/>
           <w:szCs w:val="20"/>
         </w:rPr>
-        <w:t xml:space="preserve">The TruthOrDrink instance displays the game title and rules. It then enters a loop: calling get_current_player() from GameBase to determine whose turn it is, presenting a question to that player, receiving the player’s response (answer or drink), and calling next_turn() to advance. This loop repeats until the game ends or the user exits, at which point control returns to main.</w:t>
+        <w:t xml:space="preserve">The TruthOrDrink instance displays the game title and rules. It then enters a loop: calling get_current_player() from GameBase to determine whose turn it is, presenting a question to that player, receiving the player’s response (answer or drink), and calling next_turn() to advance. This loop repeats until the game ends or the user exits.</w:t>
       </w:r>
     </w:p>
     <w:p>
       <w:pPr>
-        <w:spacing w:after="120"/>
+        <w:spacing w:before="120" w:after="120"/>
+        <w:jc w:val="center"/>
+      </w:pPr>
+      <w:r>
+        <w:drawing>
+          <wp:inline distT="0" distB="0" distL="0" distR="0">
+            <wp:extent cx="4953000" cy="3714750"/>
+            <wp:effectExtent t="0" r="0" b="0" l="0"/>
+            <wp:docPr id="1" name="" descr="" title=""/>
+            <wp:cNvGraphicFramePr>
+              <a:graphicFrameLocks xmlns:a="http://schemas.openxmlformats.org/drawingml/2006/main" noChangeAspect="1"/>
+            </wp:cNvGraphicFramePr>
+            <a:graphic xmlns:a="http://schemas.openxmlformats.org/drawingml/2006/main">
+              <a:graphicData uri="http://schemas.openxmlformats.org/drawingml/2006/picture">
+                <pic:pic xmlns:pic="http://schemas.openxmlformats.org/drawingml/2006/picture">
+                  <pic:nvPicPr>
+                    <pic:cNvPr id="0" name="" descr=""/>
+                    <pic:cNvPicPr>
+                      <a:picLocks noChangeAspect="1" noChangeArrowheads="1"/>
+                    </pic:cNvPicPr>
+                  </pic:nvPicPr>
+                  <pic:blipFill>
+                    <a:blip r:embed="rId10" cstate="none"/>
+                    <a:srcRect/>
+                    <a:stretch>
+                      <a:fillRect/>
+                    </a:stretch>
+                  </pic:blipFill>
+                  <pic:spPr bwMode="auto">
+                    <a:xfrm>
+                      <a:off x="0" y="0"/>
+                      <a:ext cx="4953000" cy="3714750"/>
+                    </a:xfrm>
+                    <a:prstGeom prst="rect">
+                      <a:avLst/>
+                    </a:prstGeom>
+                  </pic:spPr>
+                </pic:pic>
+              </a:graphicData>
+            </a:graphic>
+          </wp:inline>
+        </w:drawing>
+      </w:r>
+    </w:p>
+    <w:p>
+      <w:pPr>
+        <w:spacing w:after="200"/>
+        <w:jc w:val="center"/>
       </w:pPr>
       <w:r>
         <w:rPr>
           <w:rFonts w:ascii="Arial" w:cs="Arial" w:eastAsia="Arial" w:hAnsi="Arial"/>
           <w:i/>
           <w:iCs/>
-          <w:color w:val="666666"/>
-          <w:sz w:val="20"/>
-          <w:szCs w:val="20"/>
+          <w:color w:val="555555"/>
+          <w:sz w:val="18"/>
+          <w:szCs w:val="18"/>
         </w:rPr>
-        <w:t xml:space="preserve">[Sequence diagram to be inserted here – Actors/objects: User, TruthOrDrink, GameBase. Show the loop with get_current_player, question display, response, and next_turn calls.]</w:t>
+        <w:t xml:space="preserve">Figure 5: Sequence Diagram – Playing Truth or Drink</w:t>
       </w:r>
     </w:p>
     <w:p>

</xml_diff>